<commit_message>
fix: att a documentação
</commit_message>
<xml_diff>
--- a/T.I/SÃO PAULO TECH SCHOOL.docx
+++ b/T.I/SÃO PAULO TECH SCHOOL.docx
@@ -324,7 +324,15 @@
           <w:sz w:val="32"/>
           <w:szCs w:val="32"/>
         </w:rPr>
-        <w:t>1. INTRODUÇÃO</w:t>
+        <w:t xml:space="preserve">1. </w:t>
+      </w:r>
+      <w:r>
+        <w:rPr>
+          <w:rFonts w:asciiTheme="minorHAnsi" w:eastAsiaTheme="minorHAnsi" w:hAnsiTheme="minorHAnsi" w:cstheme="minorHAnsi"/>
+          <w:sz w:val="32"/>
+          <w:szCs w:val="32"/>
+        </w:rPr>
+        <w:t>Contexto</w:t>
       </w:r>
     </w:p>
     <w:p>
@@ -581,22 +589,29 @@
           <w:sz w:val="28"/>
           <w:szCs w:val="28"/>
         </w:rPr>
+        <w:t xml:space="preserve">A Justificativa pessoal para a escolha desse tema é minha afinidade com artes márcias e </w:t>
+      </w:r>
+      <w:r>
+        <w:rPr>
+          <w:sz w:val="28"/>
+          <w:szCs w:val="28"/>
+        </w:rPr>
+        <w:t>prática</w:t>
+      </w:r>
+      <w:r>
+        <w:rPr>
+          <w:sz w:val="28"/>
+          <w:szCs w:val="28"/>
+        </w:rPr>
+        <w:t xml:space="preserve"> das mesmas, começando a praticar como esporte </w:t>
+      </w:r>
+      <w:r>
+        <w:rPr>
+          <w:sz w:val="28"/>
+          <w:szCs w:val="28"/>
+        </w:rPr>
         <w:lastRenderedPageBreak/>
-        <w:t xml:space="preserve">A Justificativa pessoal para a escolha desse tema é minha afinidade com artes márcias e </w:t>
-      </w:r>
-      <w:r>
-        <w:rPr>
-          <w:sz w:val="28"/>
-          <w:szCs w:val="28"/>
-        </w:rPr>
-        <w:t>prática</w:t>
-      </w:r>
-      <w:r>
-        <w:rPr>
-          <w:sz w:val="28"/>
-          <w:szCs w:val="28"/>
-        </w:rPr>
-        <w:t xml:space="preserve"> das mesmas, começando a praticar como esporte com 5 anos de idade</w:t>
+        <w:t>com 5 anos de idade</w:t>
       </w:r>
       <w:r>
         <w:rPr>
@@ -610,7 +625,189 @@
           <w:sz w:val="28"/>
           <w:szCs w:val="28"/>
         </w:rPr>
-        <w:t xml:space="preserve">, com 10 anos indo fazer </w:t>
+        <w:t>, com 10 anos</w:t>
+      </w:r>
+      <w:r>
+        <w:rPr>
+          <w:sz w:val="28"/>
+          <w:szCs w:val="28"/>
+        </w:rPr>
+        <w:t xml:space="preserve"> tive uma </w:t>
+      </w:r>
+      <w:proofErr w:type="spellStart"/>
+      <w:r>
+        <w:rPr>
+          <w:sz w:val="28"/>
+          <w:szCs w:val="28"/>
+        </w:rPr>
+        <w:t>experiêcia</w:t>
+      </w:r>
+      <w:proofErr w:type="spellEnd"/>
+      <w:r>
+        <w:rPr>
+          <w:sz w:val="28"/>
+          <w:szCs w:val="28"/>
+        </w:rPr>
+        <w:t xml:space="preserve"> de 1 ano com </w:t>
+      </w:r>
+      <w:r>
+        <w:rPr>
+          <w:sz w:val="28"/>
+          <w:szCs w:val="28"/>
+        </w:rPr>
+        <w:t xml:space="preserve">o Kung-fu, e após isso eu comecei o </w:t>
+      </w:r>
+      <w:proofErr w:type="spellStart"/>
+      <w:r>
+        <w:rPr>
+          <w:sz w:val="28"/>
+          <w:szCs w:val="28"/>
+        </w:rPr>
+        <w:t>muay</w:t>
+      </w:r>
+      <w:proofErr w:type="spellEnd"/>
+      <w:r>
+        <w:rPr>
+          <w:sz w:val="28"/>
+          <w:szCs w:val="28"/>
+        </w:rPr>
+        <w:t xml:space="preserve"> </w:t>
+      </w:r>
+      <w:proofErr w:type="spellStart"/>
+      <w:r>
+        <w:rPr>
+          <w:sz w:val="28"/>
+          <w:szCs w:val="28"/>
+        </w:rPr>
+        <w:t>thai</w:t>
+      </w:r>
+      <w:proofErr w:type="spellEnd"/>
+      <w:r>
+        <w:rPr>
+          <w:sz w:val="28"/>
+          <w:szCs w:val="28"/>
+        </w:rPr>
+        <w:t xml:space="preserve"> arte marcial que eu pratiquei por anos </w:t>
+      </w:r>
+      <w:r>
+        <w:rPr>
+          <w:sz w:val="28"/>
+          <w:szCs w:val="28"/>
+        </w:rPr>
+        <w:t xml:space="preserve">e no ano passado </w:t>
+      </w:r>
+      <w:proofErr w:type="spellStart"/>
+      <w:r>
+        <w:rPr>
+          <w:sz w:val="28"/>
+          <w:szCs w:val="28"/>
+        </w:rPr>
+        <w:t>comcei</w:t>
+      </w:r>
+      <w:proofErr w:type="spellEnd"/>
+      <w:r>
+        <w:rPr>
+          <w:sz w:val="28"/>
+          <w:szCs w:val="28"/>
+        </w:rPr>
+        <w:t xml:space="preserve"> a fazer boxe e parei com o </w:t>
+      </w:r>
+      <w:proofErr w:type="spellStart"/>
+      <w:r>
+        <w:rPr>
+          <w:sz w:val="28"/>
+          <w:szCs w:val="28"/>
+        </w:rPr>
+        <w:t>mauy</w:t>
+      </w:r>
+      <w:proofErr w:type="spellEnd"/>
+      <w:r>
+        <w:rPr>
+          <w:sz w:val="28"/>
+          <w:szCs w:val="28"/>
+        </w:rPr>
+        <w:t xml:space="preserve"> </w:t>
+      </w:r>
+      <w:proofErr w:type="spellStart"/>
+      <w:r>
+        <w:rPr>
+          <w:sz w:val="28"/>
+          <w:szCs w:val="28"/>
+        </w:rPr>
+        <w:t>thai</w:t>
+      </w:r>
+      <w:proofErr w:type="spellEnd"/>
+      <w:r>
+        <w:rPr>
+          <w:sz w:val="28"/>
+          <w:szCs w:val="28"/>
+        </w:rPr>
+        <w:t xml:space="preserve">, então as lutas sempre estevem e sempre vão estar presentes em minha vida, </w:t>
+      </w:r>
+      <w:r>
+        <w:rPr>
+          <w:sz w:val="28"/>
+          <w:szCs w:val="28"/>
+        </w:rPr>
+        <w:t xml:space="preserve">elas me ensinaram que a prática leva a perfeição </w:t>
+      </w:r>
+      <w:r>
+        <w:rPr>
+          <w:sz w:val="28"/>
+          <w:szCs w:val="28"/>
+        </w:rPr>
+        <w:t>e</w:t>
+      </w:r>
+      <w:r>
+        <w:rPr>
+          <w:sz w:val="28"/>
+          <w:szCs w:val="28"/>
+        </w:rPr>
+        <w:t xml:space="preserve"> a nunca desistir </w:t>
+      </w:r>
+      <w:r>
+        <w:rPr>
+          <w:sz w:val="28"/>
+          <w:szCs w:val="28"/>
+        </w:rPr>
+        <w:t>e continuar em frente.</w:t>
+      </w:r>
+    </w:p>
+    <w:p>
+      <w:pPr>
+        <w:jc w:val="both"/>
+        <w:rPr>
+          <w:sz w:val="28"/>
+          <w:szCs w:val="28"/>
+        </w:rPr>
+      </w:pPr>
+      <w:r>
+        <w:rPr>
+          <w:sz w:val="28"/>
+          <w:szCs w:val="28"/>
+        </w:rPr>
+        <w:t xml:space="preserve">Já o UFC entrou na minha trajetória quando eu era criança ainda que eu de vez enquanto ficava acordado até de noite com o meu </w:t>
+      </w:r>
+      <w:r>
+        <w:rPr>
+          <w:sz w:val="28"/>
+          <w:szCs w:val="28"/>
+        </w:rPr>
+        <w:t>pai e via as lutas do Anderson Silva no auge de sua carreira e ficava na sala assistindo com ele, hoje em dia eu me reúno com meus amigos</w:t>
+      </w:r>
+      <w:r>
+        <w:rPr>
+          <w:sz w:val="28"/>
+          <w:szCs w:val="28"/>
+        </w:rPr>
+        <w:t xml:space="preserve"> quando tem card numerado do UFC e assistimos as lutas, o que me gerou muitos amigos e me aproximar deles </w:t>
+      </w:r>
+      <w:r>
+        <w:rPr>
+          <w:sz w:val="28"/>
+          <w:szCs w:val="28"/>
+        </w:rPr>
+        <w:t>por esse gosto em comum de lutas.</w:t>
       </w:r>
     </w:p>
     <w:p>
@@ -642,37 +839,44 @@
         <w:rPr>
           <w:b/>
           <w:bCs/>
+          <w:sz w:val="28"/>
+          <w:szCs w:val="28"/>
         </w:rPr>
       </w:pPr>
       <w:r>
         <w:rPr>
           <w:b/>
           <w:bCs/>
-        </w:rPr>
-        <w:t>3.1</w:t>
-      </w:r>
-      <w:r>
+          <w:sz w:val="28"/>
+          <w:szCs w:val="28"/>
+        </w:rPr>
+        <w:t>3.1 Objetivo Geral</w:t>
+      </w:r>
+    </w:p>
+    <w:p>
+      <w:pPr>
+        <w:jc w:val="both"/>
+        <w:rPr>
+          <w:sz w:val="28"/>
+          <w:szCs w:val="28"/>
+        </w:rPr>
+      </w:pPr>
+      <w:r>
+        <w:rPr>
+          <w:sz w:val="28"/>
+          <w:szCs w:val="28"/>
+        </w:rPr>
+        <w:t>Desenvolver uma aplicação web que permita a comparação de lutadores de MMA, apresentando dados de forma visual por meio de gráficos e interface intuitiva.</w:t>
+      </w:r>
+    </w:p>
+    <w:p>
+      <w:pPr>
+        <w:jc w:val="both"/>
         <w:rPr>
           <w:b/>
           <w:bCs/>
-        </w:rPr>
-        <w:t xml:space="preserve"> Objetivo Geral</w:t>
-      </w:r>
-    </w:p>
-    <w:p>
-      <w:pPr>
-        <w:jc w:val="both"/>
-      </w:pPr>
-      <w:r>
-        <w:t>Desenvolver uma aplicação web que permita a comparação de lutadores de MMA, apresentando dados de forma visual por meio de gráficos e interface intuitiva.</w:t>
-      </w:r>
-    </w:p>
-    <w:p>
-      <w:pPr>
-        <w:jc w:val="both"/>
-        <w:rPr>
-          <w:b/>
-          <w:bCs/>
+          <w:sz w:val="28"/>
+          <w:szCs w:val="28"/>
         </w:rPr>
       </w:pPr>
       <w:r>
@@ -680,6 +884,8 @@
           <w:rFonts w:ascii="Segoe UI Emoji" w:hAnsi="Segoe UI Emoji" w:cs="Segoe UI Emoji"/>
           <w:b/>
           <w:bCs/>
+          <w:sz w:val="28"/>
+          <w:szCs w:val="28"/>
         </w:rPr>
         <w:t>3.2</w:t>
       </w:r>
@@ -687,6 +893,8 @@
         <w:rPr>
           <w:b/>
           <w:bCs/>
+          <w:sz w:val="28"/>
+          <w:szCs w:val="28"/>
         </w:rPr>
         <w:t xml:space="preserve"> Objetivos Específicos</w:t>
       </w:r>
@@ -698,8 +906,16 @@
           <w:numId w:val="1"/>
         </w:numPr>
         <w:jc w:val="both"/>
-      </w:pPr>
-      <w:r>
+        <w:rPr>
+          <w:sz w:val="28"/>
+          <w:szCs w:val="28"/>
+        </w:rPr>
+      </w:pPr>
+      <w:r>
+        <w:rPr>
+          <w:sz w:val="28"/>
+          <w:szCs w:val="28"/>
+        </w:rPr>
         <w:t xml:space="preserve">Implementar sistema de cadastro e login de usuários </w:t>
       </w:r>
     </w:p>
@@ -710,16 +926,32 @@
           <w:numId w:val="1"/>
         </w:numPr>
         <w:jc w:val="both"/>
-      </w:pPr>
-      <w:r>
+        <w:rPr>
+          <w:sz w:val="28"/>
+          <w:szCs w:val="28"/>
+        </w:rPr>
+      </w:pPr>
+      <w:r>
+        <w:rPr>
+          <w:sz w:val="28"/>
+          <w:szCs w:val="28"/>
+        </w:rPr>
         <w:t xml:space="preserve">Desenvolver interface utilizando </w:t>
       </w:r>
       <w:proofErr w:type="spellStart"/>
       <w:r>
+        <w:rPr>
+          <w:sz w:val="28"/>
+          <w:szCs w:val="28"/>
+        </w:rPr>
         <w:t>Figma</w:t>
       </w:r>
       <w:proofErr w:type="spellEnd"/>
       <w:r>
+        <w:rPr>
+          <w:sz w:val="28"/>
+          <w:szCs w:val="28"/>
+        </w:rPr>
         <w:t xml:space="preserve"> </w:t>
       </w:r>
     </w:p>
@@ -730,8 +962,16 @@
           <w:numId w:val="1"/>
         </w:numPr>
         <w:jc w:val="both"/>
-      </w:pPr>
-      <w:r>
+        <w:rPr>
+          <w:sz w:val="28"/>
+          <w:szCs w:val="28"/>
+        </w:rPr>
+      </w:pPr>
+      <w:r>
+        <w:rPr>
+          <w:sz w:val="28"/>
+          <w:szCs w:val="28"/>
+        </w:rPr>
         <w:t xml:space="preserve">Criar funcionalidade de comparação entre lutadores </w:t>
       </w:r>
     </w:p>
@@ -742,8 +982,16 @@
           <w:numId w:val="1"/>
         </w:numPr>
         <w:jc w:val="both"/>
-      </w:pPr>
-      <w:r>
+        <w:rPr>
+          <w:sz w:val="28"/>
+          <w:szCs w:val="28"/>
+        </w:rPr>
+      </w:pPr>
+      <w:r>
+        <w:rPr>
+          <w:sz w:val="28"/>
+          <w:szCs w:val="28"/>
+        </w:rPr>
         <w:t xml:space="preserve">Implementar dashboard com gráficos </w:t>
       </w:r>
     </w:p>
@@ -754,8 +1002,16 @@
           <w:numId w:val="1"/>
         </w:numPr>
         <w:jc w:val="both"/>
-      </w:pPr>
-      <w:r>
+        <w:rPr>
+          <w:sz w:val="28"/>
+          <w:szCs w:val="28"/>
+        </w:rPr>
+      </w:pPr>
+      <w:r>
+        <w:rPr>
+          <w:sz w:val="28"/>
+          <w:szCs w:val="28"/>
+        </w:rPr>
         <w:t xml:space="preserve">Armazenar histórico de comparações </w:t>
       </w:r>
     </w:p>
@@ -766,8 +1022,16 @@
           <w:numId w:val="1"/>
         </w:numPr>
         <w:jc w:val="both"/>
-      </w:pPr>
-      <w:r>
+        <w:rPr>
+          <w:sz w:val="28"/>
+          <w:szCs w:val="28"/>
+        </w:rPr>
+      </w:pPr>
+      <w:r>
+        <w:rPr>
+          <w:sz w:val="28"/>
+          <w:szCs w:val="28"/>
+        </w:rPr>
         <w:t xml:space="preserve">Garantir boa usabilidade e experiência do usuário </w:t>
       </w:r>
     </w:p>
@@ -795,28 +1059,18 @@
         <w:rPr>
           <w:b/>
           <w:bCs/>
+          <w:sz w:val="28"/>
+          <w:szCs w:val="28"/>
         </w:rPr>
       </w:pPr>
       <w:r>
         <w:rPr>
           <w:b/>
           <w:bCs/>
-        </w:rPr>
-        <w:t xml:space="preserve"> </w:t>
-      </w:r>
-      <w:r>
-        <w:rPr>
-          <w:b/>
-          <w:bCs/>
-        </w:rPr>
-        <w:t>4.1</w:t>
-      </w:r>
-      <w:r>
-        <w:rPr>
-          <w:b/>
-          <w:bCs/>
-        </w:rPr>
-        <w:t>Escopo Incluído</w:t>
+          <w:sz w:val="28"/>
+          <w:szCs w:val="28"/>
+        </w:rPr>
+        <w:t xml:space="preserve"> 4.1Escopo Incluído</w:t>
       </w:r>
     </w:p>
     <w:p>
@@ -826,8 +1080,16 @@
           <w:numId w:val="2"/>
         </w:numPr>
         <w:jc w:val="both"/>
-      </w:pPr>
-      <w:r>
+        <w:rPr>
+          <w:sz w:val="28"/>
+          <w:szCs w:val="28"/>
+        </w:rPr>
+      </w:pPr>
+      <w:r>
+        <w:rPr>
+          <w:sz w:val="28"/>
+          <w:szCs w:val="28"/>
+        </w:rPr>
         <w:t xml:space="preserve">Tela de login e cadastro </w:t>
       </w:r>
     </w:p>
@@ -838,8 +1100,16 @@
           <w:numId w:val="2"/>
         </w:numPr>
         <w:jc w:val="both"/>
-      </w:pPr>
-      <w:r>
+        <w:rPr>
+          <w:sz w:val="28"/>
+          <w:szCs w:val="28"/>
+        </w:rPr>
+      </w:pPr>
+      <w:r>
+        <w:rPr>
+          <w:sz w:val="28"/>
+          <w:szCs w:val="28"/>
+        </w:rPr>
         <w:t xml:space="preserve">Página inicial (home) </w:t>
       </w:r>
     </w:p>
@@ -850,8 +1120,17 @@
           <w:numId w:val="2"/>
         </w:numPr>
         <w:jc w:val="both"/>
-      </w:pPr>
-      <w:r>
+        <w:rPr>
+          <w:sz w:val="28"/>
+          <w:szCs w:val="28"/>
+        </w:rPr>
+      </w:pPr>
+      <w:r>
+        <w:rPr>
+          <w:sz w:val="28"/>
+          <w:szCs w:val="28"/>
+        </w:rPr>
+        <w:lastRenderedPageBreak/>
         <w:t xml:space="preserve">Página de comparação de lutadores </w:t>
       </w:r>
     </w:p>
@@ -862,8 +1141,16 @@
           <w:numId w:val="2"/>
         </w:numPr>
         <w:jc w:val="both"/>
-      </w:pPr>
-      <w:r>
+        <w:rPr>
+          <w:sz w:val="28"/>
+          <w:szCs w:val="28"/>
+        </w:rPr>
+      </w:pPr>
+      <w:r>
+        <w:rPr>
+          <w:sz w:val="28"/>
+          <w:szCs w:val="28"/>
+        </w:rPr>
         <w:t xml:space="preserve">Dashboard com gráficos dos lutadores mais escolhidos </w:t>
       </w:r>
     </w:p>
@@ -874,8 +1161,16 @@
           <w:numId w:val="2"/>
         </w:numPr>
         <w:jc w:val="both"/>
-      </w:pPr>
-      <w:r>
+        <w:rPr>
+          <w:sz w:val="28"/>
+          <w:szCs w:val="28"/>
+        </w:rPr>
+      </w:pPr>
+      <w:r>
+        <w:rPr>
+          <w:sz w:val="28"/>
+          <w:szCs w:val="28"/>
+        </w:rPr>
         <w:t xml:space="preserve">Histórico de comparações realizadas </w:t>
       </w:r>
     </w:p>
@@ -886,8 +1181,16 @@
           <w:numId w:val="2"/>
         </w:numPr>
         <w:jc w:val="both"/>
-      </w:pPr>
-      <w:r>
+        <w:rPr>
+          <w:sz w:val="28"/>
+          <w:szCs w:val="28"/>
+        </w:rPr>
+      </w:pPr>
+      <w:r>
+        <w:rPr>
+          <w:sz w:val="28"/>
+          <w:szCs w:val="28"/>
+        </w:rPr>
         <w:t xml:space="preserve">Integração com banco de dados </w:t>
       </w:r>
     </w:p>
@@ -897,28 +1200,18 @@
         <w:rPr>
           <w:b/>
           <w:bCs/>
+          <w:sz w:val="28"/>
+          <w:szCs w:val="28"/>
         </w:rPr>
       </w:pPr>
       <w:r>
         <w:rPr>
           <w:b/>
           <w:bCs/>
-        </w:rPr>
-        <w:t xml:space="preserve"> </w:t>
-      </w:r>
-      <w:r>
-        <w:rPr>
-          <w:b/>
-          <w:bCs/>
-        </w:rPr>
-        <w:t>4.2</w:t>
-      </w:r>
-      <w:r>
-        <w:rPr>
-          <w:b/>
-          <w:bCs/>
-        </w:rPr>
-        <w:t>Escopo Não Incluído</w:t>
+          <w:sz w:val="28"/>
+          <w:szCs w:val="28"/>
+        </w:rPr>
+        <w:t xml:space="preserve"> 4.2Escopo Não Incluído</w:t>
       </w:r>
     </w:p>
     <w:p>
@@ -928,8 +1221,16 @@
           <w:numId w:val="3"/>
         </w:numPr>
         <w:jc w:val="both"/>
-      </w:pPr>
-      <w:r>
+        <w:rPr>
+          <w:sz w:val="28"/>
+          <w:szCs w:val="28"/>
+        </w:rPr>
+      </w:pPr>
+      <w:r>
+        <w:rPr>
+          <w:sz w:val="28"/>
+          <w:szCs w:val="28"/>
+        </w:rPr>
         <w:t xml:space="preserve">Cadastro de novos lutadores pelos usuários </w:t>
       </w:r>
     </w:p>
@@ -940,8 +1241,16 @@
           <w:numId w:val="3"/>
         </w:numPr>
         <w:jc w:val="both"/>
-      </w:pPr>
-      <w:r>
+        <w:rPr>
+          <w:sz w:val="28"/>
+          <w:szCs w:val="28"/>
+        </w:rPr>
+      </w:pPr>
+      <w:r>
+        <w:rPr>
+          <w:sz w:val="28"/>
+          <w:szCs w:val="28"/>
+        </w:rPr>
         <w:t xml:space="preserve">Sistema de pagamento ou monetização  </w:t>
       </w:r>
     </w:p>
@@ -952,8 +1261,16 @@
           <w:numId w:val="3"/>
         </w:numPr>
         <w:jc w:val="both"/>
-      </w:pPr>
-      <w:r>
+        <w:rPr>
+          <w:sz w:val="28"/>
+          <w:szCs w:val="28"/>
+        </w:rPr>
+      </w:pPr>
+      <w:r>
+        <w:rPr>
+          <w:sz w:val="28"/>
+          <w:szCs w:val="28"/>
+        </w:rPr>
         <w:t>Aplicativo mobile</w:t>
       </w:r>
     </w:p>
@@ -986,7 +1303,6 @@
           <w:sz w:val="32"/>
           <w:szCs w:val="32"/>
         </w:rPr>
-        <w:lastRenderedPageBreak/>
         <w:t>6. PARTES INTERESSADAS (STAKEHOLDERS)</w:t>
       </w:r>
     </w:p>
@@ -1003,8 +1319,8 @@
         <w:tblLook w:val="04A0" w:firstRow="1" w:lastRow="0" w:firstColumn="1" w:lastColumn="0" w:noHBand="0" w:noVBand="1"/>
       </w:tblPr>
       <w:tblGrid>
-        <w:gridCol w:w="1738"/>
-        <w:gridCol w:w="2874"/>
+        <w:gridCol w:w="2015"/>
+        <w:gridCol w:w="3340"/>
       </w:tblGrid>
       <w:tr>
         <w:trPr>
@@ -1023,12 +1339,16 @@
               <w:rPr>
                 <w:b/>
                 <w:bCs/>
+                <w:sz w:val="28"/>
+                <w:szCs w:val="28"/>
               </w:rPr>
             </w:pPr>
             <w:r>
               <w:rPr>
                 <w:b/>
                 <w:bCs/>
+                <w:sz w:val="28"/>
+                <w:szCs w:val="28"/>
               </w:rPr>
               <w:t>Stakeholder</w:t>
             </w:r>
@@ -1046,12 +1366,16 @@
               <w:rPr>
                 <w:b/>
                 <w:bCs/>
+                <w:sz w:val="28"/>
+                <w:szCs w:val="28"/>
               </w:rPr>
             </w:pPr>
             <w:r>
               <w:rPr>
                 <w:b/>
                 <w:bCs/>
+                <w:sz w:val="28"/>
+                <w:szCs w:val="28"/>
               </w:rPr>
               <w:t>Papel no Projeto</w:t>
             </w:r>
@@ -1071,8 +1395,16 @@
           <w:p>
             <w:pPr>
               <w:jc w:val="both"/>
+              <w:rPr>
+                <w:sz w:val="28"/>
+                <w:szCs w:val="28"/>
+              </w:rPr>
             </w:pPr>
             <w:r>
+              <w:rPr>
+                <w:sz w:val="28"/>
+                <w:szCs w:val="28"/>
+              </w:rPr>
               <w:t>Desenvolvedores</w:t>
             </w:r>
           </w:p>
@@ -1086,8 +1418,16 @@
           <w:p>
             <w:pPr>
               <w:jc w:val="both"/>
+              <w:rPr>
+                <w:sz w:val="28"/>
+                <w:szCs w:val="28"/>
+              </w:rPr>
             </w:pPr>
             <w:r>
+              <w:rPr>
+                <w:sz w:val="28"/>
+                <w:szCs w:val="28"/>
+              </w:rPr>
               <w:t>Desenvolvimento do sistema</w:t>
             </w:r>
           </w:p>
@@ -1106,8 +1446,16 @@
           <w:p>
             <w:pPr>
               <w:jc w:val="both"/>
+              <w:rPr>
+                <w:sz w:val="28"/>
+                <w:szCs w:val="28"/>
+              </w:rPr>
             </w:pPr>
             <w:r>
+              <w:rPr>
+                <w:sz w:val="28"/>
+                <w:szCs w:val="28"/>
+              </w:rPr>
               <w:t>Cliente</w:t>
             </w:r>
           </w:p>
@@ -1121,8 +1469,16 @@
           <w:p>
             <w:pPr>
               <w:jc w:val="both"/>
+              <w:rPr>
+                <w:sz w:val="28"/>
+                <w:szCs w:val="28"/>
+              </w:rPr>
             </w:pPr>
             <w:r>
+              <w:rPr>
+                <w:sz w:val="28"/>
+                <w:szCs w:val="28"/>
+              </w:rPr>
               <w:t>Avaliação e orientação</w:t>
             </w:r>
           </w:p>
@@ -1141,8 +1497,16 @@
           <w:p>
             <w:pPr>
               <w:jc w:val="both"/>
+              <w:rPr>
+                <w:sz w:val="28"/>
+                <w:szCs w:val="28"/>
+              </w:rPr>
             </w:pPr>
             <w:r>
+              <w:rPr>
+                <w:sz w:val="28"/>
+                <w:szCs w:val="28"/>
+              </w:rPr>
               <w:t>Usuários finais</w:t>
             </w:r>
           </w:p>
@@ -1156,8 +1520,16 @@
           <w:p>
             <w:pPr>
               <w:jc w:val="both"/>
+              <w:rPr>
+                <w:sz w:val="28"/>
+                <w:szCs w:val="28"/>
+              </w:rPr>
             </w:pPr>
             <w:r>
+              <w:rPr>
+                <w:sz w:val="28"/>
+                <w:szCs w:val="28"/>
+              </w:rPr>
               <w:t>Utilização do sistema</w:t>
             </w:r>
           </w:p>
@@ -1195,16 +1567,32 @@
     <w:p>
       <w:pPr>
         <w:jc w:val="both"/>
-      </w:pPr>
-      <w:r>
+        <w:rPr>
+          <w:sz w:val="28"/>
+          <w:szCs w:val="28"/>
+        </w:rPr>
+      </w:pPr>
+      <w:r>
+        <w:rPr>
+          <w:sz w:val="28"/>
+          <w:szCs w:val="28"/>
+        </w:rPr>
         <w:t>As premissas são condições consideradas verdadeiras para o planejamento e desenvolvimento do projeto.</w:t>
       </w:r>
     </w:p>
     <w:p>
       <w:pPr>
         <w:jc w:val="both"/>
-      </w:pPr>
-      <w:r>
+        <w:rPr>
+          <w:sz w:val="28"/>
+          <w:szCs w:val="28"/>
+        </w:rPr>
+      </w:pPr>
+      <w:r>
+        <w:rPr>
+          <w:sz w:val="28"/>
+          <w:szCs w:val="28"/>
+        </w:rPr>
         <w:t>Para o projeto UFC Fighting, foram consideradas as seguintes premissas:</w:t>
       </w:r>
     </w:p>
@@ -1215,8 +1603,16 @@
           <w:numId w:val="4"/>
         </w:numPr>
         <w:jc w:val="both"/>
-      </w:pPr>
-      <w:r>
+        <w:rPr>
+          <w:sz w:val="28"/>
+          <w:szCs w:val="28"/>
+        </w:rPr>
+      </w:pPr>
+      <w:r>
+        <w:rPr>
+          <w:sz w:val="28"/>
+          <w:szCs w:val="28"/>
+        </w:rPr>
         <w:t xml:space="preserve">O sistema será desenvolvido individualmente pelo aluno </w:t>
       </w:r>
     </w:p>
@@ -1227,8 +1623,16 @@
           <w:numId w:val="4"/>
         </w:numPr>
         <w:jc w:val="both"/>
-      </w:pPr>
-      <w:r>
+        <w:rPr>
+          <w:sz w:val="28"/>
+          <w:szCs w:val="28"/>
+        </w:rPr>
+      </w:pPr>
+      <w:r>
+        <w:rPr>
+          <w:sz w:val="28"/>
+          <w:szCs w:val="28"/>
+        </w:rPr>
         <w:t xml:space="preserve">Os lutadores disponíveis para comparação serão fixos e previamente definidos </w:t>
       </w:r>
     </w:p>
@@ -1239,8 +1643,16 @@
           <w:numId w:val="4"/>
         </w:numPr>
         <w:jc w:val="both"/>
-      </w:pPr>
-      <w:r>
+        <w:rPr>
+          <w:sz w:val="28"/>
+          <w:szCs w:val="28"/>
+        </w:rPr>
+      </w:pPr>
+      <w:r>
+        <w:rPr>
+          <w:sz w:val="28"/>
+          <w:szCs w:val="28"/>
+        </w:rPr>
         <w:t xml:space="preserve">Os usuários terão acesso ao sistema por meio de navegador web </w:t>
       </w:r>
     </w:p>
@@ -1251,8 +1663,17 @@
           <w:numId w:val="4"/>
         </w:numPr>
         <w:jc w:val="both"/>
-      </w:pPr>
-      <w:r>
+        <w:rPr>
+          <w:sz w:val="28"/>
+          <w:szCs w:val="28"/>
+        </w:rPr>
+      </w:pPr>
+      <w:r>
+        <w:rPr>
+          <w:sz w:val="28"/>
+          <w:szCs w:val="28"/>
+        </w:rPr>
+        <w:lastRenderedPageBreak/>
         <w:t xml:space="preserve">O banco de dados estará disponível e funcional durante o desenvolvimento </w:t>
       </w:r>
     </w:p>
@@ -1263,8 +1684,16 @@
           <w:numId w:val="4"/>
         </w:numPr>
         <w:jc w:val="both"/>
-      </w:pPr>
-      <w:r>
+        <w:rPr>
+          <w:sz w:val="28"/>
+          <w:szCs w:val="28"/>
+        </w:rPr>
+      </w:pPr>
+      <w:r>
+        <w:rPr>
+          <w:sz w:val="28"/>
+          <w:szCs w:val="28"/>
+        </w:rPr>
         <w:t xml:space="preserve">A API fornecida será suficiente para atender às necessidades do projeto </w:t>
       </w:r>
     </w:p>
@@ -1275,8 +1704,16 @@
           <w:numId w:val="4"/>
         </w:numPr>
         <w:jc w:val="both"/>
-      </w:pPr>
-      <w:r>
+        <w:rPr>
+          <w:sz w:val="28"/>
+          <w:szCs w:val="28"/>
+        </w:rPr>
+      </w:pPr>
+      <w:r>
+        <w:rPr>
+          <w:sz w:val="28"/>
+          <w:szCs w:val="28"/>
+        </w:rPr>
         <w:t xml:space="preserve">O prazo estabelecido será suficiente para a conclusão das funcionalidades principais </w:t>
       </w:r>
     </w:p>
@@ -1287,16 +1724,32 @@
           <w:numId w:val="4"/>
         </w:numPr>
         <w:jc w:val="both"/>
-      </w:pPr>
-      <w:r>
+        <w:rPr>
+          <w:sz w:val="28"/>
+          <w:szCs w:val="28"/>
+        </w:rPr>
+      </w:pPr>
+      <w:r>
+        <w:rPr>
+          <w:sz w:val="28"/>
+          <w:szCs w:val="28"/>
+        </w:rPr>
         <w:t xml:space="preserve">As tecnologias utilizadas (Node.js, MySQL e </w:t>
       </w:r>
       <w:proofErr w:type="spellStart"/>
       <w:r>
+        <w:rPr>
+          <w:sz w:val="28"/>
+          <w:szCs w:val="28"/>
+        </w:rPr>
         <w:t>Figma</w:t>
       </w:r>
       <w:proofErr w:type="spellEnd"/>
       <w:r>
+        <w:rPr>
+          <w:sz w:val="28"/>
+          <w:szCs w:val="28"/>
+        </w:rPr>
         <w:t xml:space="preserve">) serão compatíveis entre si </w:t>
       </w:r>
     </w:p>
@@ -1307,8 +1760,16 @@
           <w:numId w:val="4"/>
         </w:numPr>
         <w:jc w:val="both"/>
-      </w:pPr>
-      <w:r>
+        <w:rPr>
+          <w:sz w:val="28"/>
+          <w:szCs w:val="28"/>
+        </w:rPr>
+      </w:pPr>
+      <w:r>
+        <w:rPr>
+          <w:sz w:val="28"/>
+          <w:szCs w:val="28"/>
+        </w:rPr>
         <w:t xml:space="preserve">O usuário terá conhecimentos básicos para utilizar o sistema </w:t>
       </w:r>
     </w:p>
@@ -1341,6 +1802,8 @@
         <w:rPr>
           <w:b/>
           <w:bCs/>
+          <w:sz w:val="28"/>
+          <w:szCs w:val="28"/>
         </w:rPr>
       </w:pPr>
       <w:r>
@@ -1348,6 +1811,8 @@
           <w:rFonts w:ascii="Segoe UI Emoji" w:hAnsi="Segoe UI Emoji" w:cs="Segoe UI Emoji"/>
           <w:b/>
           <w:bCs/>
+          <w:sz w:val="28"/>
+          <w:szCs w:val="28"/>
         </w:rPr>
         <w:t xml:space="preserve">8.1 </w:t>
       </w:r>
@@ -1355,6 +1820,8 @@
         <w:rPr>
           <w:b/>
           <w:bCs/>
+          <w:sz w:val="28"/>
+          <w:szCs w:val="28"/>
         </w:rPr>
         <w:t>Requisitos Funcionais</w:t>
       </w:r>
@@ -1366,8 +1833,16 @@
           <w:numId w:val="5"/>
         </w:numPr>
         <w:jc w:val="both"/>
-      </w:pPr>
-      <w:r>
+        <w:rPr>
+          <w:sz w:val="28"/>
+          <w:szCs w:val="28"/>
+        </w:rPr>
+      </w:pPr>
+      <w:r>
+        <w:rPr>
+          <w:sz w:val="28"/>
+          <w:szCs w:val="28"/>
+        </w:rPr>
         <w:t xml:space="preserve">O sistema deve permitir cadastro de usuários </w:t>
       </w:r>
     </w:p>
@@ -1378,8 +1853,16 @@
           <w:numId w:val="5"/>
         </w:numPr>
         <w:jc w:val="both"/>
-      </w:pPr>
-      <w:r>
+        <w:rPr>
+          <w:sz w:val="28"/>
+          <w:szCs w:val="28"/>
+        </w:rPr>
+      </w:pPr>
+      <w:r>
+        <w:rPr>
+          <w:sz w:val="28"/>
+          <w:szCs w:val="28"/>
+        </w:rPr>
         <w:t xml:space="preserve">O sistema deve permitir login </w:t>
       </w:r>
     </w:p>
@@ -1390,8 +1873,16 @@
           <w:numId w:val="5"/>
         </w:numPr>
         <w:jc w:val="both"/>
-      </w:pPr>
-      <w:r>
+        <w:rPr>
+          <w:sz w:val="28"/>
+          <w:szCs w:val="28"/>
+        </w:rPr>
+      </w:pPr>
+      <w:r>
+        <w:rPr>
+          <w:sz w:val="28"/>
+          <w:szCs w:val="28"/>
+        </w:rPr>
         <w:t xml:space="preserve">O usuário deve poder selecionar lutadores </w:t>
       </w:r>
     </w:p>
@@ -1402,8 +1893,16 @@
           <w:numId w:val="5"/>
         </w:numPr>
         <w:jc w:val="both"/>
-      </w:pPr>
-      <w:r>
+        <w:rPr>
+          <w:sz w:val="28"/>
+          <w:szCs w:val="28"/>
+        </w:rPr>
+      </w:pPr>
+      <w:r>
+        <w:rPr>
+          <w:sz w:val="28"/>
+          <w:szCs w:val="28"/>
+        </w:rPr>
         <w:t xml:space="preserve">O sistema deve realizar comparação entre lutadores </w:t>
       </w:r>
     </w:p>
@@ -1414,8 +1913,16 @@
           <w:numId w:val="5"/>
         </w:numPr>
         <w:jc w:val="both"/>
-      </w:pPr>
-      <w:r>
+        <w:rPr>
+          <w:sz w:val="28"/>
+          <w:szCs w:val="28"/>
+        </w:rPr>
+      </w:pPr>
+      <w:r>
+        <w:rPr>
+          <w:sz w:val="28"/>
+          <w:szCs w:val="28"/>
+        </w:rPr>
         <w:t xml:space="preserve">O sistema deve exibir gráficos de desempenho </w:t>
       </w:r>
     </w:p>
@@ -1426,9 +1933,16 @@
           <w:numId w:val="5"/>
         </w:numPr>
         <w:jc w:val="both"/>
-      </w:pPr>
-      <w:r>
-        <w:lastRenderedPageBreak/>
+        <w:rPr>
+          <w:sz w:val="28"/>
+          <w:szCs w:val="28"/>
+        </w:rPr>
+      </w:pPr>
+      <w:r>
+        <w:rPr>
+          <w:sz w:val="28"/>
+          <w:szCs w:val="28"/>
+        </w:rPr>
         <w:t xml:space="preserve">O sistema deve registrar histórico de comparações </w:t>
       </w:r>
     </w:p>
@@ -1438,28 +1952,18 @@
         <w:rPr>
           <w:b/>
           <w:bCs/>
+          <w:sz w:val="28"/>
+          <w:szCs w:val="28"/>
         </w:rPr>
       </w:pPr>
       <w:r>
         <w:rPr>
           <w:b/>
           <w:bCs/>
-        </w:rPr>
-        <w:t xml:space="preserve"> </w:t>
-      </w:r>
-      <w:r>
-        <w:rPr>
-          <w:b/>
-          <w:bCs/>
-        </w:rPr>
-        <w:t xml:space="preserve">8.2 </w:t>
-      </w:r>
-      <w:r>
-        <w:rPr>
-          <w:b/>
-          <w:bCs/>
-        </w:rPr>
-        <w:t>Requisitos Não Funcionais</w:t>
+          <w:sz w:val="28"/>
+          <w:szCs w:val="28"/>
+        </w:rPr>
+        <w:t xml:space="preserve"> 8.2 Requisitos Não Funcionais</w:t>
       </w:r>
     </w:p>
     <w:p>
@@ -1469,8 +1973,16 @@
           <w:numId w:val="6"/>
         </w:numPr>
         <w:jc w:val="both"/>
-      </w:pPr>
-      <w:r>
+        <w:rPr>
+          <w:sz w:val="28"/>
+          <w:szCs w:val="28"/>
+        </w:rPr>
+      </w:pPr>
+      <w:r>
+        <w:rPr>
+          <w:sz w:val="28"/>
+          <w:szCs w:val="28"/>
+        </w:rPr>
         <w:t xml:space="preserve">Interface intuitiva e de fácil navegação </w:t>
       </w:r>
     </w:p>
@@ -1481,8 +1993,16 @@
           <w:numId w:val="6"/>
         </w:numPr>
         <w:jc w:val="both"/>
-      </w:pPr>
-      <w:r>
+        <w:rPr>
+          <w:sz w:val="28"/>
+          <w:szCs w:val="28"/>
+        </w:rPr>
+      </w:pPr>
+      <w:r>
+        <w:rPr>
+          <w:sz w:val="28"/>
+          <w:szCs w:val="28"/>
+        </w:rPr>
         <w:t xml:space="preserve">Tempo de resposta rápido </w:t>
       </w:r>
     </w:p>
@@ -1493,8 +2013,16 @@
           <w:numId w:val="6"/>
         </w:numPr>
         <w:jc w:val="both"/>
-      </w:pPr>
-      <w:r>
+        <w:rPr>
+          <w:sz w:val="28"/>
+          <w:szCs w:val="28"/>
+        </w:rPr>
+      </w:pPr>
+      <w:r>
+        <w:rPr>
+          <w:sz w:val="28"/>
+          <w:szCs w:val="28"/>
+        </w:rPr>
         <w:t xml:space="preserve">Compatibilidade com navegadores modernos </w:t>
       </w:r>
     </w:p>
@@ -1505,8 +2033,16 @@
           <w:numId w:val="6"/>
         </w:numPr>
         <w:jc w:val="both"/>
-      </w:pPr>
-      <w:r>
+        <w:rPr>
+          <w:sz w:val="28"/>
+          <w:szCs w:val="28"/>
+        </w:rPr>
+      </w:pPr>
+      <w:r>
+        <w:rPr>
+          <w:sz w:val="28"/>
+          <w:szCs w:val="28"/>
+        </w:rPr>
         <w:t xml:space="preserve">Layout responsivo </w:t>
       </w:r>
     </w:p>
@@ -1517,8 +2053,16 @@
           <w:numId w:val="6"/>
         </w:numPr>
         <w:jc w:val="both"/>
-      </w:pPr>
-      <w:r>
+        <w:rPr>
+          <w:sz w:val="28"/>
+          <w:szCs w:val="28"/>
+        </w:rPr>
+      </w:pPr>
+      <w:r>
+        <w:rPr>
+          <w:sz w:val="28"/>
+          <w:szCs w:val="28"/>
+        </w:rPr>
         <w:t>Segurança básica de dados (senha protegida)</w:t>
       </w:r>
     </w:p>
@@ -1533,21 +2077,18 @@
         <w:rPr>
           <w:b/>
           <w:bCs/>
+          <w:sz w:val="32"/>
+          <w:szCs w:val="32"/>
         </w:rPr>
       </w:pPr>
       <w:r>
         <w:rPr>
           <w:b/>
           <w:bCs/>
-        </w:rPr>
-        <w:t>9.</w:t>
-      </w:r>
-      <w:r>
-        <w:rPr>
-          <w:b/>
-          <w:bCs/>
-        </w:rPr>
-        <w:t>Recursos Humanos</w:t>
+          <w:sz w:val="32"/>
+          <w:szCs w:val="32"/>
+        </w:rPr>
+        <w:t>9.Recursos Humanos</w:t>
       </w:r>
     </w:p>
     <w:p>
@@ -1557,8 +2098,17 @@
           <w:numId w:val="7"/>
         </w:numPr>
         <w:jc w:val="both"/>
-      </w:pPr>
-      <w:r>
+        <w:rPr>
+          <w:sz w:val="28"/>
+          <w:szCs w:val="28"/>
+        </w:rPr>
+      </w:pPr>
+      <w:r>
+        <w:rPr>
+          <w:sz w:val="28"/>
+          <w:szCs w:val="28"/>
+        </w:rPr>
+        <w:lastRenderedPageBreak/>
         <w:t xml:space="preserve">Equipe de desenvolvimento (aluno) </w:t>
       </w:r>
     </w:p>
@@ -1568,6 +2118,8 @@
         <w:rPr>
           <w:b/>
           <w:bCs/>
+          <w:sz w:val="28"/>
+          <w:szCs w:val="28"/>
         </w:rPr>
       </w:pPr>
       <w:r>
@@ -1575,6 +2127,8 @@
           <w:rFonts w:ascii="Segoe UI Emoji" w:hAnsi="Segoe UI Emoji" w:cs="Segoe UI Emoji"/>
           <w:b/>
           <w:bCs/>
+          <w:sz w:val="28"/>
+          <w:szCs w:val="28"/>
         </w:rPr>
         <w:t>9.1</w:t>
       </w:r>
@@ -1582,6 +2136,8 @@
         <w:rPr>
           <w:b/>
           <w:bCs/>
+          <w:sz w:val="28"/>
+          <w:szCs w:val="28"/>
         </w:rPr>
         <w:t xml:space="preserve"> Recursos Tecnológicos</w:t>
       </w:r>
@@ -1593,8 +2149,16 @@
           <w:numId w:val="8"/>
         </w:numPr>
         <w:jc w:val="both"/>
-      </w:pPr>
-      <w:r>
+        <w:rPr>
+          <w:sz w:val="28"/>
+          <w:szCs w:val="28"/>
+        </w:rPr>
+      </w:pPr>
+      <w:r>
+        <w:rPr>
+          <w:sz w:val="28"/>
+          <w:szCs w:val="28"/>
+        </w:rPr>
         <w:t xml:space="preserve">Computador </w:t>
       </w:r>
     </w:p>
@@ -1605,8 +2169,16 @@
           <w:numId w:val="8"/>
         </w:numPr>
         <w:jc w:val="both"/>
-      </w:pPr>
-      <w:r>
+        <w:rPr>
+          <w:sz w:val="28"/>
+          <w:szCs w:val="28"/>
+        </w:rPr>
+      </w:pPr>
+      <w:r>
+        <w:rPr>
+          <w:sz w:val="28"/>
+          <w:szCs w:val="28"/>
+        </w:rPr>
         <w:t xml:space="preserve">Internet </w:t>
       </w:r>
     </w:p>
@@ -1617,13 +2189,25 @@
           <w:numId w:val="8"/>
         </w:numPr>
         <w:jc w:val="both"/>
+        <w:rPr>
+          <w:sz w:val="28"/>
+          <w:szCs w:val="28"/>
+        </w:rPr>
       </w:pPr>
       <w:proofErr w:type="spellStart"/>
       <w:r>
+        <w:rPr>
+          <w:sz w:val="28"/>
+          <w:szCs w:val="28"/>
+        </w:rPr>
         <w:t>Figma</w:t>
       </w:r>
       <w:proofErr w:type="spellEnd"/>
       <w:r>
+        <w:rPr>
+          <w:sz w:val="28"/>
+          <w:szCs w:val="28"/>
+        </w:rPr>
         <w:t xml:space="preserve"> </w:t>
       </w:r>
     </w:p>
@@ -1634,16 +2218,32 @@
           <w:numId w:val="8"/>
         </w:numPr>
         <w:jc w:val="both"/>
-      </w:pPr>
-      <w:r>
+        <w:rPr>
+          <w:sz w:val="28"/>
+          <w:szCs w:val="28"/>
+        </w:rPr>
+      </w:pPr>
+      <w:r>
+        <w:rPr>
+          <w:sz w:val="28"/>
+          <w:szCs w:val="28"/>
+        </w:rPr>
         <w:t xml:space="preserve">Visual Studio </w:t>
       </w:r>
       <w:proofErr w:type="spellStart"/>
       <w:r>
+        <w:rPr>
+          <w:sz w:val="28"/>
+          <w:szCs w:val="28"/>
+        </w:rPr>
         <w:t>Code</w:t>
       </w:r>
       <w:proofErr w:type="spellEnd"/>
       <w:r>
+        <w:rPr>
+          <w:sz w:val="28"/>
+          <w:szCs w:val="28"/>
+        </w:rPr>
         <w:t xml:space="preserve"> </w:t>
       </w:r>
     </w:p>
@@ -1654,8 +2254,16 @@
           <w:numId w:val="8"/>
         </w:numPr>
         <w:jc w:val="both"/>
-      </w:pPr>
-      <w:r>
+        <w:rPr>
+          <w:sz w:val="28"/>
+          <w:szCs w:val="28"/>
+        </w:rPr>
+      </w:pPr>
+      <w:r>
+        <w:rPr>
+          <w:sz w:val="28"/>
+          <w:szCs w:val="28"/>
+        </w:rPr>
         <w:t xml:space="preserve">MySQL </w:t>
       </w:r>
     </w:p>
@@ -1666,8 +2274,16 @@
           <w:numId w:val="8"/>
         </w:numPr>
         <w:jc w:val="both"/>
-      </w:pPr>
-      <w:r>
+        <w:rPr>
+          <w:sz w:val="28"/>
+          <w:szCs w:val="28"/>
+        </w:rPr>
+      </w:pPr>
+      <w:r>
+        <w:rPr>
+          <w:sz w:val="28"/>
+          <w:szCs w:val="28"/>
+        </w:rPr>
         <w:t xml:space="preserve">Node.js </w:t>
       </w:r>
     </w:p>
@@ -1679,13 +2295,26 @@
     </w:p>
     <w:p>
       <w:pPr>
-        <w:ind w:left="360"/>
-        <w:jc w:val="both"/>
-      </w:pPr>
-    </w:p>
-    <w:p>
-      <w:pPr>
-        <w:ind w:left="360"/>
+        <w:jc w:val="both"/>
+      </w:pPr>
+    </w:p>
+    <w:p>
+      <w:pPr>
+        <w:jc w:val="both"/>
+      </w:pPr>
+    </w:p>
+    <w:p>
+      <w:pPr>
+        <w:jc w:val="both"/>
+      </w:pPr>
+    </w:p>
+    <w:p>
+      <w:pPr>
+        <w:jc w:val="both"/>
+      </w:pPr>
+    </w:p>
+    <w:p>
+      <w:pPr>
         <w:jc w:val="both"/>
         <w:rPr>
           <w:b/>
@@ -1697,113 +2326,38 @@
           <w:b/>
           <w:bCs/>
         </w:rPr>
-        <w:t>10</w:t>
+        <w:t>13</w:t>
       </w:r>
       <w:r>
         <w:rPr>
           <w:b/>
           <w:bCs/>
         </w:rPr>
-        <w:t>. CONTEXTO PESSOAL E MOTIVAÇÃO</w:t>
-      </w:r>
-    </w:p>
-    <w:p>
-      <w:pPr>
-        <w:ind w:left="360"/>
-        <w:jc w:val="both"/>
-      </w:pPr>
-    </w:p>
-    <w:p>
-      <w:pPr>
-        <w:ind w:left="360"/>
-        <w:jc w:val="both"/>
-      </w:pPr>
-    </w:p>
-    <w:p>
-      <w:pPr>
-        <w:ind w:left="360"/>
+        <w:t>. PRINCIPAIS DIFICULDADES</w:t>
+      </w:r>
+    </w:p>
+    <w:p>
+      <w:pPr>
         <w:jc w:val="both"/>
         <w:rPr>
           <w:b/>
           <w:bCs/>
         </w:rPr>
       </w:pPr>
-      <w:r>
+    </w:p>
+    <w:p>
+      <w:pPr>
+        <w:jc w:val="both"/>
         <w:rPr>
           <w:b/>
           <w:bCs/>
         </w:rPr>
-        <w:t>12.</w:t>
-      </w:r>
+      </w:pPr>
       <w:r>
         <w:rPr>
           <w:b/>
           <w:bCs/>
         </w:rPr>
-        <w:t>VALORES REPRESENTADOS NO PROJETO</w:t>
-      </w:r>
-    </w:p>
-    <w:p>
-      <w:pPr>
-        <w:jc w:val="both"/>
-      </w:pPr>
-    </w:p>
-    <w:p>
-      <w:pPr>
-        <w:jc w:val="both"/>
-      </w:pPr>
-    </w:p>
-    <w:p>
-      <w:pPr>
-        <w:jc w:val="both"/>
-      </w:pPr>
-    </w:p>
-    <w:p>
-      <w:pPr>
-        <w:jc w:val="both"/>
-        <w:rPr>
-          <w:b/>
-          <w:bCs/>
-        </w:rPr>
-      </w:pPr>
-      <w:r>
-        <w:rPr>
-          <w:b/>
-          <w:bCs/>
-        </w:rPr>
-        <w:t>13</w:t>
-      </w:r>
-      <w:r>
-        <w:rPr>
-          <w:b/>
-          <w:bCs/>
-        </w:rPr>
-        <w:t>. PRINCIPAIS DIFICULDADES</w:t>
-      </w:r>
-    </w:p>
-    <w:p>
-      <w:pPr>
-        <w:jc w:val="both"/>
-        <w:rPr>
-          <w:b/>
-          <w:bCs/>
-        </w:rPr>
-      </w:pPr>
-    </w:p>
-    <w:p>
-      <w:pPr>
-        <w:jc w:val="both"/>
-        <w:rPr>
-          <w:b/>
-          <w:bCs/>
-        </w:rPr>
-      </w:pPr>
-      <w:r>
-        <w:rPr>
-          <w:b/>
-          <w:bCs/>
-        </w:rPr>
-        <w:lastRenderedPageBreak/>
         <w:t>14.</w:t>
       </w:r>
       <w:r>

</xml_diff>